<commit_message>
Polish Chapter 3 methodology presentation
</commit_message>
<xml_diff>
--- a/deliverables/final_report_sections/05_Methodology.docx
+++ b/deliverables/final_report_sections/05_Methodology.docx
@@ -1,6 +1,6 @@
 
 <file path=word/document.xml><?xml version="1.0" encoding="utf-8"?>
-<w:document xmlns:w="http://schemas.openxmlformats.org/wordprocessingml/2006/main">
+<w:document xmlns:m="http://schemas.openxmlformats.org/officeDocument/2006/math" xmlns:w="http://schemas.openxmlformats.org/wordprocessingml/2006/main">
   <w:body>
     <w:p>
       <w:pPr>
@@ -414,7 +414,7 @@
         <w:jc w:val="left"/>
       </w:pPr>
       <w:r>
-        <w:t xml:space="preserve">[Figure 3.1 placeholder — Research methodology and evidence streams] Educational records are converted into canonical observations and cutoff-safe learner states, which feed the E1 predictive evaluation and E4 temporal audit. A separate E2 path compares plain and schema-constrained generation on a frozen protocol. A third operational path passes workspace snapshots through Qwen, deterministic validation, bounded repair or abstention, and instructor review. Human triage and support actions remain separate from model outputs.</w:t>
+        <w:t>[Figure 3.1 placeholder — Replace with the final methodology and evidence-stream diagram during visual integration.] Educational records are converted into canonical observations and cutoff-safe learner states, which feed the E1 predictive evaluation and E4 temporal audit. A separate E2 path compares plain and schema-constrained generation on a frozen protocol. A third operational path passes workspace snapshots through Qwen, deterministic validation, bounded repair or abstention, and instructor review. Human triage and support actions remain separate from model outputs.</w:t>
       </w:r>
     </w:p>
     <w:p>
@@ -1433,7 +1433,82 @@
     <w:p>
       <w:pPr/>
       <w:r>
-        <w:t xml:space="preserve">For learner i at checkpoint t, the temporal state can be expressed as s_(i,t) = (x_(i,t), m_(i,t), p_(i,t)), where x_(i,t) contains derived feature values, m_(i,t) records the availability or missingness interpretation of each value, and p_(i,t) records provenance. Every included activity or submission observation must have a course-relative day less than or equal to the applicable cutoff. A week-t state is therefore neither the learner’s full-course state nor a retrospective summary.</w:t>
+        <w:t>For learner i at checkpoint t, the temporal state can be expressed as</w:t>
+      </w:r>
+    </w:p>
+    <w:p>
+      <w:pPr>
+        <w:jc w:val="center"/>
+      </w:pPr>
+      <m:oMathPara>
+        <m:oMath>
+          <m:sSub>
+            <m:e>
+              <m:r>
+                <m:t>s</m:t>
+              </m:r>
+            </m:e>
+            <m:sub>
+              <m:r>
+                <m:t>(i,t)</m:t>
+              </m:r>
+            </m:sub>
+          </m:sSub>
+          <m:r>
+            <m:t> = (</m:t>
+          </m:r>
+          <m:sSub>
+            <m:e>
+              <m:r>
+                <m:t>x</m:t>
+              </m:r>
+            </m:e>
+            <m:sub>
+              <m:r>
+                <m:t>(i,t)</m:t>
+              </m:r>
+            </m:sub>
+          </m:sSub>
+          <m:r>
+            <m:t>, </m:t>
+          </m:r>
+          <m:sSub>
+            <m:e>
+              <m:r>
+                <m:t>m</m:t>
+              </m:r>
+            </m:e>
+            <m:sub>
+              <m:r>
+                <m:t>(i,t)</m:t>
+              </m:r>
+            </m:sub>
+          </m:sSub>
+          <m:r>
+            <m:t>, </m:t>
+          </m:r>
+          <m:sSub>
+            <m:e>
+              <m:r>
+                <m:t>p</m:t>
+              </m:r>
+            </m:e>
+            <m:sub>
+              <m:r>
+                <m:t>(i,t)</m:t>
+              </m:r>
+            </m:sub>
+          </m:sSub>
+          <m:r>
+            <m:t>)</m:t>
+          </m:r>
+        </m:oMath>
+      </m:oMathPara>
+    </w:p>
+    <w:p>
+      <w:pPr/>
+      <w:r>
+        <w:t>, where x_(i,t) contains derived feature values, m_(i,t) records the availability or missingness interpretation of each value, and p_(i,t) records provenance. Every included activity or submission observation must have a course-relative day less than or equal to the applicable cutoff. A week-t state is therefore neither the learner’s full-course state nor a retrospective summary.</w:t>
       </w:r>
     </w:p>
     <w:p>
@@ -2792,6 +2867,15 @@
       <w:r>
         <w:rPr/>
         <w:t xml:space="preserve">These controls improve repeatability but do not remove environmental dependencies. E2 inference depended on a particular local Ollama model build and hardware environment, and the operational snapshot does not include a restorable production database dump. Reproduction must therefore distinguish bitwise artifact verification, deterministic offline rescoring, and new inference execution.</w:t>
+      </w:r>
+    </w:p>
+    <w:p>
+      <w:pPr/>
+      <w:r>
+        <w:rPr>
+          <w:i/>
+        </w:rPr>
+        <w:t>Final-integration citation note: Reconcile citations for scikit-learn (LogisticRegression and StandardScaler) and percentile bootstrap confidence intervals after the consolidated bibliography is finalized; do not assign citation numbers in this chapter yet.</w:t>
       </w:r>
     </w:p>
     <w:p>

</xml_diff>